<commit_message>
Gate Modules C/E/G to hunted species only
Tools (C), timing (E) and abundance (G) now show only animals marked
"ever hunted: yes" in Module B, so we stop collecting not-comparable data about
animals a respondent doesn't hunt (the pilot showed these grids being filled for
every species regardless). Module H (rules) is intentionally left ungated —
rules about not hunting are most relevant for protected species nobody hunts.

- Grids show an empty-state hint when no animal is marked hunted yet.
- CSV column layout unchanged (550 cols); gated species just stay blank.
- Interviewer guide and paper questionnaire updated with the same instruction.
- E2E covers the gating (hunted species shown, non-hunted hidden).

Co-Authored-By: Claude Opus 4.8 <noreply@anthropic.com>
Claude-Session: https://claude.ai/code/session_01WBADq1mAGXBC8npA3LtAz1
</commit_message>
<xml_diff>
--- a/docs/MCA_Hunt_Interviewer_Guide.docx
+++ b/docs/MCA_Hunt_Interviewer_Guide.docx
@@ -655,406 +655,6 @@
     </w:p>
     <w:p>
       <w:pPr>
-        <w:pStyle w:val="ListParagraph"/>
-        <w:numPr>
-          <w:ilvl w:val="0"/>
-          <w:numId w:val="2"/>
-        </w:numPr>
-        <w:spacing w:after="40"/>
-      </w:pPr>
-      <w:r>
-        <w:t xml:space="preserve">For each animal, tick </w:t>
-      </w:r>
-      <w:r>
-        <w:rPr>
-          <w:b/>
-          <w:bCs/>
-        </w:rPr>
-        <w:t xml:space="preserve">every tool ever used</w:t>
-      </w:r>
-      <w:r>
-        <w:t xml:space="preserve"> to hunt it. The tool names are the column headers (turned sideways) — no codes to look up.</w:t>
-      </w:r>
-    </w:p>
-    <w:p>
-      <w:pPr>
-        <w:pStyle w:val="ListParagraph"/>
-        <w:numPr>
-          <w:ilvl w:val="0"/>
-          <w:numId w:val="2"/>
-        </w:numPr>
-        <w:spacing w:after="40"/>
-      </w:pPr>
-      <w:r>
-        <w:t xml:space="preserve">Ask the </w:t>
-      </w:r>
-      <w:r>
-        <w:rPr>
-          <w:b/>
-          <w:bCs/>
-        </w:rPr>
-        <w:t xml:space="preserve">preferred tool</w:t>
-      </w:r>
-      <w:r>
-        <w:t xml:space="preserve"> and </w:t>
-      </w:r>
-      <w:r>
-        <w:rPr>
-          <w:b/>
-          <w:bCs/>
-        </w:rPr>
-        <w:t xml:space="preserve">why</w:t>
-      </w:r>
-      <w:r>
-        <w:t xml:space="preserve"> (write their words). Ask whether tools have </w:t>
-      </w:r>
-      <w:r>
-        <w:rPr>
-          <w:b/>
-          <w:bCs/>
-        </w:rPr>
-        <w:t xml:space="preserve">changed</w:t>
-      </w:r>
-      <w:r>
-        <w:t xml:space="preserve">, and if so which were used before.</w:t>
-      </w:r>
-    </w:p>
-    <w:p>
-      <w:pPr>
-        <w:pStyle w:val="ListParagraph"/>
-        <w:numPr>
-          <w:ilvl w:val="0"/>
-          <w:numId w:val="2"/>
-        </w:numPr>
-        <w:spacing w:after="40"/>
-      </w:pPr>
-      <w:r>
-        <w:t xml:space="preserve">Ask whether they usually hunt </w:t>
-      </w:r>
-      <w:r>
-        <w:rPr>
-          <w:b/>
-          <w:bCs/>
-        </w:rPr>
-        <w:t xml:space="preserve">alone or with others</w:t>
-      </w:r>
-      <w:r>
-        <w:t xml:space="preserve">. Note any change over time.</w:t>
-      </w:r>
-    </w:p>
-    <w:p>
-      <w:pPr>
-        <w:pBdr>
-          <w:bottom w:val="single" w:color="D6DDD6" w:sz="6"/>
-        </w:pBdr>
-        <w:spacing w:after="60" w:before="60"/>
-      </w:pPr>
-    </w:p>
-    <w:p>
-      <w:pPr>
-        <w:pStyle w:val="Heading1"/>
-        <w:spacing w:after="90" w:before="220"/>
-      </w:pPr>
-      <w:r>
-        <w:rPr>
-          <w:b/>
-          <w:bCs/>
-          <w:color w:val="256D40"/>
-          <w:sz w:val="28"/>
-          <w:szCs w:val="28"/>
-        </w:rPr>
-        <w:t xml:space="preserve">Module D — Tenure and limits</w:t>
-      </w:r>
-    </w:p>
-    <w:p>
-      <w:pPr>
-        <w:pStyle w:val="ListParagraph"/>
-        <w:numPr>
-          <w:ilvl w:val="0"/>
-          <w:numId w:val="2"/>
-        </w:numPr>
-        <w:spacing w:after="40"/>
-      </w:pPr>
-      <w:r>
-        <w:t xml:space="preserve">Ask which </w:t>
-      </w:r>
-      <w:r>
-        <w:rPr>
-          <w:b/>
-          <w:bCs/>
-        </w:rPr>
-        <w:t xml:space="preserve">area</w:t>
-      </w:r>
-      <w:r>
-        <w:t xml:space="preserve"> they mainly hunt (own clan land, with permission, shared/open, other) — </w:t>
-      </w:r>
-      <w:r>
-        <w:rPr>
-          <w:b/>
-          <w:bCs/>
-        </w:rPr>
-        <w:t xml:space="preserve">never where</w:t>
-      </w:r>
-      <w:r>
-        <w:t xml:space="preserve">.</w:t>
-      </w:r>
-    </w:p>
-    <w:p>
-      <w:pPr>
-        <w:pStyle w:val="ListParagraph"/>
-        <w:numPr>
-          <w:ilvl w:val="0"/>
-          <w:numId w:val="2"/>
-        </w:numPr>
-        <w:spacing w:after="40"/>
-      </w:pPr>
-      <w:r>
-        <w:t xml:space="preserve">Ask about </w:t>
-      </w:r>
-      <w:r>
-        <w:rPr>
-          <w:b/>
-          <w:bCs/>
-        </w:rPr>
-        <w:t xml:space="preserve">restricted places</w:t>
-      </w:r>
-      <w:r>
-        <w:t xml:space="preserve"> (tambu/sacred, clan no-take, none, other) — again, the </w:t>
-      </w:r>
-      <w:r>
-        <w:rPr>
-          <w:b/>
-          <w:bCs/>
-        </w:rPr>
-        <w:t xml:space="preserve">kind</w:t>
-      </w:r>
-      <w:r>
-        <w:t xml:space="preserve">, never the location.</w:t>
-      </w:r>
-    </w:p>
-    <w:p>
-      <w:pPr>
-        <w:pStyle w:val="ListParagraph"/>
-        <w:numPr>
-          <w:ilvl w:val="0"/>
-          <w:numId w:val="2"/>
-        </w:numPr>
-        <w:spacing w:after="40"/>
-      </w:pPr>
-      <w:r>
-        <w:t xml:space="preserve">Ask about limits: are there </w:t>
-      </w:r>
-      <w:r>
-        <w:rPr>
-          <w:b/>
-          <w:bCs/>
-        </w:rPr>
-        <w:t xml:space="preserve">seasonal</w:t>
-      </w:r>
-      <w:r>
-        <w:t xml:space="preserve"> limits, limits on the </w:t>
-      </w:r>
-      <w:r>
-        <w:rPr>
-          <w:b/>
-          <w:bCs/>
-        </w:rPr>
-        <w:t xml:space="preserve">number taken</w:t>
-      </w:r>
-      <w:r>
-        <w:t xml:space="preserve">, or limits on the </w:t>
-      </w:r>
-      <w:r>
-        <w:rPr>
-          <w:b/>
-          <w:bCs/>
-        </w:rPr>
-        <w:t xml:space="preserve">number of trips</w:t>
-      </w:r>
-      <w:r>
-        <w:t xml:space="preserve">? For each, Yes/No/Not sure and a note if yes.</w:t>
-      </w:r>
-    </w:p>
-    <w:p>
-      <w:pPr>
-        <w:pBdr>
-          <w:bottom w:val="single" w:color="D6DDD6" w:sz="6"/>
-        </w:pBdr>
-        <w:spacing w:after="60" w:before="60"/>
-      </w:pPr>
-    </w:p>
-    <w:p>
-      <w:pPr>
-        <w:pStyle w:val="Heading1"/>
-        <w:spacing w:after="90" w:before="220"/>
-      </w:pPr>
-      <w:r>
-        <w:rPr>
-          <w:b/>
-          <w:bCs/>
-          <w:color w:val="256D40"/>
-          <w:sz w:val="28"/>
-          <w:szCs w:val="28"/>
-        </w:rPr>
-        <w:t xml:space="preserve">Module E — Timing</w:t>
-      </w:r>
-    </w:p>
-    <w:p>
-      <w:pPr>
-        <w:pStyle w:val="ListParagraph"/>
-        <w:numPr>
-          <w:ilvl w:val="0"/>
-          <w:numId w:val="2"/>
-        </w:numPr>
-        <w:spacing w:after="40"/>
-      </w:pPr>
-      <w:r>
-        <w:t xml:space="preserve">For each animal, tick the </w:t>
-      </w:r>
-      <w:r>
-        <w:rPr>
-          <w:b/>
-          <w:bCs/>
-        </w:rPr>
-        <w:t xml:space="preserve">months</w:t>
-      </w:r>
-      <w:r>
-        <w:t xml:space="preserve"> it is typically hunted (ever). Tick only what applies.</w:t>
-      </w:r>
-    </w:p>
-    <w:p>
-      <w:pPr>
-        <w:pStyle w:val="ListParagraph"/>
-        <w:numPr>
-          <w:ilvl w:val="0"/>
-          <w:numId w:val="2"/>
-        </w:numPr>
-        <w:spacing w:after="40"/>
-      </w:pPr>
-      <w:r>
-        <w:t xml:space="preserve">Note any change in timing over time.</w:t>
-      </w:r>
-    </w:p>
-    <w:p>
-      <w:pPr>
-        <w:pBdr>
-          <w:bottom w:val="single" w:color="D6DDD6" w:sz="6"/>
-        </w:pBdr>
-        <w:spacing w:after="60" w:before="60"/>
-      </w:pPr>
-    </w:p>
-    <w:p>
-      <w:pPr>
-        <w:pStyle w:val="Heading1"/>
-        <w:spacing w:after="90" w:before="220"/>
-      </w:pPr>
-      <w:r>
-        <w:rPr>
-          <w:b/>
-          <w:bCs/>
-          <w:color w:val="256D40"/>
-          <w:sz w:val="28"/>
-          <w:szCs w:val="28"/>
-        </w:rPr>
-        <w:t xml:space="preserve">Module F — Recent hunting (these days)</w:t>
-      </w:r>
-    </w:p>
-    <w:p>
-      <w:pPr>
-        <w:spacing w:after="100"/>
-      </w:pPr>
-      <w:r>
-        <w:t xml:space="preserve">These questions are about their hunting </w:t>
-      </w:r>
-      <w:r>
-        <w:rPr>
-          <w:b/>
-          <w:bCs/>
-        </w:rPr>
-        <w:t xml:space="preserve">now / the last 12 months</w:t>
-      </w:r>
-      <w:r>
-        <w:t xml:space="preserve">.</w:t>
-      </w:r>
-    </w:p>
-    <w:p>
-      <w:pPr>
-        <w:pStyle w:val="ListParagraph"/>
-        <w:numPr>
-          <w:ilvl w:val="0"/>
-          <w:numId w:val="2"/>
-        </w:numPr>
-        <w:spacing w:after="40"/>
-      </w:pPr>
-      <w:r>
-        <w:t xml:space="preserve">Ask where most of their take comes from: mostly </w:t>
-      </w:r>
-      <w:r>
-        <w:rPr>
-          <w:b/>
-          <w:bCs/>
-        </w:rPr>
-        <w:t xml:space="preserve">dedicated</w:t>
-      </w:r>
-      <w:r>
-        <w:t xml:space="preserve"> hunting trips, mostly </w:t>
-      </w:r>
-      <w:r>
-        <w:rPr>
-          <w:b/>
-          <w:bCs/>
-        </w:rPr>
-        <w:t xml:space="preserve">incidental</w:t>
-      </w:r>
-      <w:r>
-        <w:t xml:space="preserve">, or half and half.</w:t>
-      </w:r>
-    </w:p>
-    <w:p>
-      <w:pPr>
-        <w:pStyle w:val="ListParagraph"/>
-        <w:numPr>
-          <w:ilvl w:val="0"/>
-          <w:numId w:val="2"/>
-        </w:numPr>
-        <w:spacing w:after="40"/>
-      </w:pPr>
-      <w:r>
-        <w:t xml:space="preserve">For the </w:t>
-      </w:r>
-      <w:r>
-        <w:rPr>
-          <w:b/>
-          <w:bCs/>
-        </w:rPr>
-        <w:t xml:space="preserve">most recent trip</w:t>
-      </w:r>
-      <w:r>
-        <w:t xml:space="preserve"> and the </w:t>
-      </w:r>
-      <w:r>
-        <w:rPr>
-          <w:b/>
-          <w:bCs/>
-        </w:rPr>
-        <w:t xml:space="preserve">most successful trip</w:t>
-      </w:r>
-      <w:r>
-        <w:t xml:space="preserve"> (let them decide what “successful” means): when, how long, targeted or general, and </w:t>
-      </w:r>
-      <w:r>
-        <w:rPr>
-          <w:b/>
-          <w:bCs/>
-        </w:rPr>
-        <w:t xml:space="preserve">what was caught</w:t>
-      </w:r>
-      <w:r>
-        <w:t xml:space="preserve"> (add a row per animal with a count).</w:t>
-      </w:r>
-    </w:p>
-    <w:p>
-      <w:pPr>
         <w:pBdr>
           <w:left w:val="single" w:color="256D40" w:sz="18" w:space="8"/>
         </w:pBdr>
@@ -1063,47 +663,106 @@
         <w:ind w:left="160"/>
       </w:pPr>
       <w:r>
-        <w:rPr>
-          <w:b/>
-          <w:bCs/>
-        </w:rPr>
-        <w:t xml:space="preserve">Shares — “divide into 10 parts.” </w:t>
-      </w:r>
-      <w:r>
-        <w:t xml:space="preserve">Of everything caught on that trip, split 10 parts across </w:t>
-      </w:r>
-      <w:r>
-        <w:rPr>
-          <w:b/>
-          <w:bCs/>
-        </w:rPr>
-        <w:t xml:space="preserve">Eaten, Given away, Bilas/ceremonial, Sold</w:t>
-      </w:r>
-      <w:r>
-        <w:t xml:space="preserve">. Use the + / − buttons; the total should read 10 / 10. (If they’re unsure, it’s fine to leave it.)</w:t>
-      </w:r>
-    </w:p>
-    <w:p>
-      <w:pPr>
-        <w:pStyle w:val="ListParagraph"/>
-        <w:numPr>
-          <w:ilvl w:val="0"/>
-          <w:numId w:val="2"/>
-        </w:numPr>
-        <w:spacing w:after="40"/>
-      </w:pPr>
-      <w:r>
-        <w:t xml:space="preserve">Ask how long a </w:t>
-      </w:r>
-      <w:r>
-        <w:rPr>
-          <w:b/>
-          <w:bCs/>
-        </w:rPr>
-        <w:t xml:space="preserve">typical</w:t>
-      </w:r>
-      <w:r>
-        <w:t xml:space="preserve"> trip lasts these days (or “no longer hunt”).</w:t>
+        <w:t xml:space="preserve">Only animals marked </w:t>
+      </w:r>
+      <w:r>
+        <w:rPr>
+          <w:b/>
+          <w:bCs/>
+        </w:rPr>
+        <w:t xml:space="preserve">"ever hunted: yes"</w:t>
+      </w:r>
+      <w:r>
+        <w:t xml:space="preserve"> in Module B appear here. If an animal is missing, that is why — go back to Module B if it should be included.</w:t>
+      </w:r>
+    </w:p>
+    <w:p>
+      <w:pPr>
+        <w:pStyle w:val="ListParagraph"/>
+        <w:numPr>
+          <w:ilvl w:val="0"/>
+          <w:numId w:val="2"/>
+        </w:numPr>
+        <w:spacing w:after="40"/>
+      </w:pPr>
+      <w:r>
+        <w:t xml:space="preserve">For each animal shown, tick </w:t>
+      </w:r>
+      <w:r>
+        <w:rPr>
+          <w:b/>
+          <w:bCs/>
+        </w:rPr>
+        <w:t xml:space="preserve">every tool ever used</w:t>
+      </w:r>
+      <w:r>
+        <w:t xml:space="preserve"> to hunt it. The tool names are the column headers (turned sideways) — no codes to look up.</w:t>
+      </w:r>
+    </w:p>
+    <w:p>
+      <w:pPr>
+        <w:pStyle w:val="ListParagraph"/>
+        <w:numPr>
+          <w:ilvl w:val="0"/>
+          <w:numId w:val="2"/>
+        </w:numPr>
+        <w:spacing w:after="40"/>
+      </w:pPr>
+      <w:r>
+        <w:t xml:space="preserve">Ask the </w:t>
+      </w:r>
+      <w:r>
+        <w:rPr>
+          <w:b/>
+          <w:bCs/>
+        </w:rPr>
+        <w:t xml:space="preserve">preferred tool</w:t>
+      </w:r>
+      <w:r>
+        <w:t xml:space="preserve"> and </w:t>
+      </w:r>
+      <w:r>
+        <w:rPr>
+          <w:b/>
+          <w:bCs/>
+        </w:rPr>
+        <w:t xml:space="preserve">why</w:t>
+      </w:r>
+      <w:r>
+        <w:t xml:space="preserve"> (write their words). Ask whether tools have </w:t>
+      </w:r>
+      <w:r>
+        <w:rPr>
+          <w:b/>
+          <w:bCs/>
+        </w:rPr>
+        <w:t xml:space="preserve">changed</w:t>
+      </w:r>
+      <w:r>
+        <w:t xml:space="preserve">, and if so which were used before.</w:t>
+      </w:r>
+    </w:p>
+    <w:p>
+      <w:pPr>
+        <w:pStyle w:val="ListParagraph"/>
+        <w:numPr>
+          <w:ilvl w:val="0"/>
+          <w:numId w:val="2"/>
+        </w:numPr>
+        <w:spacing w:after="40"/>
+      </w:pPr>
+      <w:r>
+        <w:t xml:space="preserve">Ask whether they usually hunt </w:t>
+      </w:r>
+      <w:r>
+        <w:rPr>
+          <w:b/>
+          <w:bCs/>
+        </w:rPr>
+        <w:t xml:space="preserve">alone or with others</w:t>
+      </w:r>
+      <w:r>
+        <w:t xml:space="preserve">. Note any change over time.</w:t>
       </w:r>
     </w:p>
     <w:p>
@@ -1127,6 +786,380 @@
           <w:sz w:val="28"/>
           <w:szCs w:val="28"/>
         </w:rPr>
+        <w:t xml:space="preserve">Module D — Tenure and limits</w:t>
+      </w:r>
+    </w:p>
+    <w:p>
+      <w:pPr>
+        <w:pStyle w:val="ListParagraph"/>
+        <w:numPr>
+          <w:ilvl w:val="0"/>
+          <w:numId w:val="2"/>
+        </w:numPr>
+        <w:spacing w:after="40"/>
+      </w:pPr>
+      <w:r>
+        <w:t xml:space="preserve">Ask which </w:t>
+      </w:r>
+      <w:r>
+        <w:rPr>
+          <w:b/>
+          <w:bCs/>
+        </w:rPr>
+        <w:t xml:space="preserve">area</w:t>
+      </w:r>
+      <w:r>
+        <w:t xml:space="preserve"> they mainly hunt (own clan land, with permission, shared/open, other) — </w:t>
+      </w:r>
+      <w:r>
+        <w:rPr>
+          <w:b/>
+          <w:bCs/>
+        </w:rPr>
+        <w:t xml:space="preserve">never where</w:t>
+      </w:r>
+      <w:r>
+        <w:t xml:space="preserve">.</w:t>
+      </w:r>
+    </w:p>
+    <w:p>
+      <w:pPr>
+        <w:pStyle w:val="ListParagraph"/>
+        <w:numPr>
+          <w:ilvl w:val="0"/>
+          <w:numId w:val="2"/>
+        </w:numPr>
+        <w:spacing w:after="40"/>
+      </w:pPr>
+      <w:r>
+        <w:t xml:space="preserve">Ask about </w:t>
+      </w:r>
+      <w:r>
+        <w:rPr>
+          <w:b/>
+          <w:bCs/>
+        </w:rPr>
+        <w:t xml:space="preserve">restricted places</w:t>
+      </w:r>
+      <w:r>
+        <w:t xml:space="preserve"> (tambu/sacred, clan no-take, none, other) — again, the </w:t>
+      </w:r>
+      <w:r>
+        <w:rPr>
+          <w:b/>
+          <w:bCs/>
+        </w:rPr>
+        <w:t xml:space="preserve">kind</w:t>
+      </w:r>
+      <w:r>
+        <w:t xml:space="preserve">, never the location.</w:t>
+      </w:r>
+    </w:p>
+    <w:p>
+      <w:pPr>
+        <w:pStyle w:val="ListParagraph"/>
+        <w:numPr>
+          <w:ilvl w:val="0"/>
+          <w:numId w:val="2"/>
+        </w:numPr>
+        <w:spacing w:after="40"/>
+      </w:pPr>
+      <w:r>
+        <w:t xml:space="preserve">Ask about limits: are there </w:t>
+      </w:r>
+      <w:r>
+        <w:rPr>
+          <w:b/>
+          <w:bCs/>
+        </w:rPr>
+        <w:t xml:space="preserve">seasonal</w:t>
+      </w:r>
+      <w:r>
+        <w:t xml:space="preserve"> limits, limits on the </w:t>
+      </w:r>
+      <w:r>
+        <w:rPr>
+          <w:b/>
+          <w:bCs/>
+        </w:rPr>
+        <w:t xml:space="preserve">number taken</w:t>
+      </w:r>
+      <w:r>
+        <w:t xml:space="preserve">, or limits on the </w:t>
+      </w:r>
+      <w:r>
+        <w:rPr>
+          <w:b/>
+          <w:bCs/>
+        </w:rPr>
+        <w:t xml:space="preserve">number of trips</w:t>
+      </w:r>
+      <w:r>
+        <w:t xml:space="preserve">? For each, Yes/No/Not sure and a note if yes.</w:t>
+      </w:r>
+    </w:p>
+    <w:p>
+      <w:pPr>
+        <w:pBdr>
+          <w:bottom w:val="single" w:color="D6DDD6" w:sz="6"/>
+        </w:pBdr>
+        <w:spacing w:after="60" w:before="60"/>
+      </w:pPr>
+    </w:p>
+    <w:p>
+      <w:pPr>
+        <w:pStyle w:val="Heading1"/>
+        <w:spacing w:after="90" w:before="220"/>
+      </w:pPr>
+      <w:r>
+        <w:rPr>
+          <w:b/>
+          <w:bCs/>
+          <w:color w:val="256D40"/>
+          <w:sz w:val="28"/>
+          <w:szCs w:val="28"/>
+        </w:rPr>
+        <w:t xml:space="preserve">Module E — Timing</w:t>
+      </w:r>
+    </w:p>
+    <w:p>
+      <w:pPr>
+        <w:pStyle w:val="ListParagraph"/>
+        <w:numPr>
+          <w:ilvl w:val="0"/>
+          <w:numId w:val="2"/>
+        </w:numPr>
+        <w:spacing w:after="40"/>
+      </w:pPr>
+      <w:r>
+        <w:t xml:space="preserve">Only animals they </w:t>
+      </w:r>
+      <w:r>
+        <w:rPr>
+          <w:b/>
+          <w:bCs/>
+        </w:rPr>
+        <w:t xml:space="preserve">hunt</w:t>
+      </w:r>
+      <w:r>
+        <w:t xml:space="preserve"> (Module B = yes) are shown. For each, tick the </w:t>
+      </w:r>
+      <w:r>
+        <w:rPr>
+          <w:b/>
+          <w:bCs/>
+        </w:rPr>
+        <w:t xml:space="preserve">months</w:t>
+      </w:r>
+      <w:r>
+        <w:t xml:space="preserve"> it is typically hunted. Tick only what applies.</w:t>
+      </w:r>
+    </w:p>
+    <w:p>
+      <w:pPr>
+        <w:pStyle w:val="ListParagraph"/>
+        <w:numPr>
+          <w:ilvl w:val="0"/>
+          <w:numId w:val="2"/>
+        </w:numPr>
+        <w:spacing w:after="40"/>
+      </w:pPr>
+      <w:r>
+        <w:t xml:space="preserve">Note any change in timing over time.</w:t>
+      </w:r>
+    </w:p>
+    <w:p>
+      <w:pPr>
+        <w:pBdr>
+          <w:bottom w:val="single" w:color="D6DDD6" w:sz="6"/>
+        </w:pBdr>
+        <w:spacing w:after="60" w:before="60"/>
+      </w:pPr>
+    </w:p>
+    <w:p>
+      <w:pPr>
+        <w:pStyle w:val="Heading1"/>
+        <w:spacing w:after="90" w:before="220"/>
+      </w:pPr>
+      <w:r>
+        <w:rPr>
+          <w:b/>
+          <w:bCs/>
+          <w:color w:val="256D40"/>
+          <w:sz w:val="28"/>
+          <w:szCs w:val="28"/>
+        </w:rPr>
+        <w:t xml:space="preserve">Module F — Recent hunting (these days)</w:t>
+      </w:r>
+    </w:p>
+    <w:p>
+      <w:pPr>
+        <w:spacing w:after="100"/>
+      </w:pPr>
+      <w:r>
+        <w:t xml:space="preserve">These questions are about their hunting </w:t>
+      </w:r>
+      <w:r>
+        <w:rPr>
+          <w:b/>
+          <w:bCs/>
+        </w:rPr>
+        <w:t xml:space="preserve">now / the last 12 months</w:t>
+      </w:r>
+      <w:r>
+        <w:t xml:space="preserve">.</w:t>
+      </w:r>
+    </w:p>
+    <w:p>
+      <w:pPr>
+        <w:pStyle w:val="ListParagraph"/>
+        <w:numPr>
+          <w:ilvl w:val="0"/>
+          <w:numId w:val="2"/>
+        </w:numPr>
+        <w:spacing w:after="40"/>
+      </w:pPr>
+      <w:r>
+        <w:t xml:space="preserve">Ask where most of their take comes from: mostly </w:t>
+      </w:r>
+      <w:r>
+        <w:rPr>
+          <w:b/>
+          <w:bCs/>
+        </w:rPr>
+        <w:t xml:space="preserve">dedicated</w:t>
+      </w:r>
+      <w:r>
+        <w:t xml:space="preserve"> hunting trips, mostly </w:t>
+      </w:r>
+      <w:r>
+        <w:rPr>
+          <w:b/>
+          <w:bCs/>
+        </w:rPr>
+        <w:t xml:space="preserve">incidental</w:t>
+      </w:r>
+      <w:r>
+        <w:t xml:space="preserve">, or half and half.</w:t>
+      </w:r>
+    </w:p>
+    <w:p>
+      <w:pPr>
+        <w:pStyle w:val="ListParagraph"/>
+        <w:numPr>
+          <w:ilvl w:val="0"/>
+          <w:numId w:val="2"/>
+        </w:numPr>
+        <w:spacing w:after="40"/>
+      </w:pPr>
+      <w:r>
+        <w:t xml:space="preserve">For the </w:t>
+      </w:r>
+      <w:r>
+        <w:rPr>
+          <w:b/>
+          <w:bCs/>
+        </w:rPr>
+        <w:t xml:space="preserve">most recent trip</w:t>
+      </w:r>
+      <w:r>
+        <w:t xml:space="preserve"> and the </w:t>
+      </w:r>
+      <w:r>
+        <w:rPr>
+          <w:b/>
+          <w:bCs/>
+        </w:rPr>
+        <w:t xml:space="preserve">most successful trip</w:t>
+      </w:r>
+      <w:r>
+        <w:t xml:space="preserve"> (let them decide what “successful” means): when, how long, targeted or general, and </w:t>
+      </w:r>
+      <w:r>
+        <w:rPr>
+          <w:b/>
+          <w:bCs/>
+        </w:rPr>
+        <w:t xml:space="preserve">what was caught</w:t>
+      </w:r>
+      <w:r>
+        <w:t xml:space="preserve"> (add a row per animal with a count).</w:t>
+      </w:r>
+    </w:p>
+    <w:p>
+      <w:pPr>
+        <w:pBdr>
+          <w:left w:val="single" w:color="256D40" w:sz="18" w:space="8"/>
+        </w:pBdr>
+        <w:shd w:fill="EEF4EF" w:val="clear"/>
+        <w:spacing w:after="120" w:before="80"/>
+        <w:ind w:left="160"/>
+      </w:pPr>
+      <w:r>
+        <w:rPr>
+          <w:b/>
+          <w:bCs/>
+        </w:rPr>
+        <w:t xml:space="preserve">Shares — “divide into 10 parts.” </w:t>
+      </w:r>
+      <w:r>
+        <w:t xml:space="preserve">Of everything caught on that trip, split 10 parts across </w:t>
+      </w:r>
+      <w:r>
+        <w:rPr>
+          <w:b/>
+          <w:bCs/>
+        </w:rPr>
+        <w:t xml:space="preserve">Eaten, Given away, Bilas/ceremonial, Sold</w:t>
+      </w:r>
+      <w:r>
+        <w:t xml:space="preserve">. Use the + / − buttons; the total should read 10 / 10. (If they’re unsure, it’s fine to leave it.)</w:t>
+      </w:r>
+    </w:p>
+    <w:p>
+      <w:pPr>
+        <w:pStyle w:val="ListParagraph"/>
+        <w:numPr>
+          <w:ilvl w:val="0"/>
+          <w:numId w:val="2"/>
+        </w:numPr>
+        <w:spacing w:after="40"/>
+      </w:pPr>
+      <w:r>
+        <w:t xml:space="preserve">Ask how long a </w:t>
+      </w:r>
+      <w:r>
+        <w:rPr>
+          <w:b/>
+          <w:bCs/>
+        </w:rPr>
+        <w:t xml:space="preserve">typical</w:t>
+      </w:r>
+      <w:r>
+        <w:t xml:space="preserve"> trip lasts these days (or “no longer hunt”).</w:t>
+      </w:r>
+    </w:p>
+    <w:p>
+      <w:pPr>
+        <w:pBdr>
+          <w:bottom w:val="single" w:color="D6DDD6" w:sz="6"/>
+        </w:pBdr>
+        <w:spacing w:after="60" w:before="60"/>
+      </w:pPr>
+    </w:p>
+    <w:p>
+      <w:pPr>
+        <w:pStyle w:val="Heading1"/>
+        <w:spacing w:after="90" w:before="220"/>
+      </w:pPr>
+      <w:r>
+        <w:rPr>
+          <w:b/>
+          <w:bCs/>
+          <w:color w:val="256D40"/>
+          <w:sz w:val="28"/>
+          <w:szCs w:val="28"/>
+        </w:rPr>
         <w:t xml:space="preserve">Module G — Change over time</w:t>
       </w:r>
     </w:p>
@@ -1135,7 +1168,17 @@
         <w:spacing w:after="100"/>
       </w:pPr>
       <w:r>
-        <w:t xml:space="preserve">For each animal, at each age </w:t>
+        <w:t xml:space="preserve">Only animals they </w:t>
+      </w:r>
+      <w:r>
+        <w:rPr>
+          <w:b/>
+          <w:bCs/>
+        </w:rPr>
+        <w:t xml:space="preserve">hunt</w:t>
+      </w:r>
+      <w:r>
+        <w:t xml:space="preserve"> are shown. For each, at each age </w:t>
       </w:r>
       <w:r>
         <w:rPr>

</xml_diff>

<commit_message>
P1 safeguards: consent recording, Zone/GPS confirm, share warning
- Consent: required tick on the consent screen (interview won't start without
  it); stored as consent_given + consent_time; shown on Review and exported.
- Module A: soft confirm on Next if Zone (needed for the ID) or GPS is missing.
- Module F: soft confirm on Next if a trip's 10-part share split totals 1–9.
- Review screen flags "no ID / no GPS" before Complete.
- All soft (interviewer can continue) except consent, which is required.
- Export now 678 columns; export test + both Playwright suites pass (incl.
  "cannot start without consent" and "consent recorded"); guide updated.

Co-Authored-By: Claude Opus 4.8 <noreply@anthropic.com>
Claude-Session: https://claude.ai/code/session_01WBADq1mAGXBC8npA3LtAz1
</commit_message>
<xml_diff>
--- a/docs/MCA_Hunt_Interviewer_Guide.docx
+++ b/docs/MCA_Hunt_Interviewer_Guide.docx
@@ -96,7 +96,17 @@
         <w:t xml:space="preserve">Consent first. </w:t>
       </w:r>
       <w:r>
-        <w:t xml:space="preserve">Read the consent aloud. Only start if the person agrees. If they decline, cancel — nothing is saved.</w:t>
+        <w:t xml:space="preserve">Read the consent aloud. If the person agrees, </w:t>
+      </w:r>
+      <w:r>
+        <w:rPr>
+          <w:b/>
+          <w:bCs/>
+        </w:rPr>
+        <w:t xml:space="preserve">tick the consent box</w:t>
+      </w:r>
+      <w:r>
+        <w:t xml:space="preserve"> and tap Start — the app will not start without it, and the consent is recorded with the interview. If they decline, cancel — nothing is saved.</w:t>
       </w:r>
     </w:p>
     <w:p>
@@ -479,6 +489,39 @@
       </w:r>
       <w:r>
         <w:t xml:space="preserve">. Use this for people (often women) who fish but don’t hunt. “Hunts” skips fishing; “Both” asks everything.</w:t>
+      </w:r>
+    </w:p>
+    <w:p>
+      <w:pPr>
+        <w:pBdr>
+          <w:left w:val="single" w:color="256D40" w:sz="18" w:space="8"/>
+        </w:pBdr>
+        <w:shd w:fill="EEF4EF" w:val="clear"/>
+        <w:spacing w:after="120" w:before="80"/>
+        <w:ind w:left="160"/>
+      </w:pPr>
+      <w:r>
+        <w:t xml:space="preserve">If you tap Next without a </w:t>
+      </w:r>
+      <w:r>
+        <w:rPr>
+          <w:b/>
+          <w:bCs/>
+        </w:rPr>
+        <w:t xml:space="preserve">Zone</w:t>
+      </w:r>
+      <w:r>
+        <w:t xml:space="preserve"> (needed for the ID) or without </w:t>
+      </w:r>
+      <w:r>
+        <w:rPr>
+          <w:b/>
+          <w:bCs/>
+        </w:rPr>
+        <w:t xml:space="preserve">GPS</w:t>
+      </w:r>
+      <w:r>
+        <w:t xml:space="preserve">, the app asks you to confirm — go back and fix if you can, but you can still continue.</w:t>
       </w:r>
     </w:p>
     <w:p>

</xml_diff>

<commit_message>
Add thank-you script, final gap-check, and sampling quota; v2.4.0
- Review screen now shows a thank-you script to read aloud (thanks the
  respondent; explains answers inform conservation planning).
- "Complete interview" runs a final check: if consent/ID/GPS is missing or a
  trip's shares don't total 10, a soft confirm lists the gaps before finalising.
- Sampling quota set in the guides: 45 per zone, ~equal across 25–39/40–59/60+,
  >=20% women, more where many fishers.
- Interviewer guide gains a daily "check Location is ON" reminder; student guide
  updated for the thank-you + final check.
- Fixed stale config comments (scope now hunting+fishing; 20 tools).
- Tests + both E2E suites pass.

Co-Authored-By: Claude Opus 4.8 <noreply@anthropic.com>
Claude-Session: https://claude.ai/code/session_01WBADq1mAGXBC8npA3LtAz1
</commit_message>
<xml_diff>
--- a/docs/MCA_Hunt_Interviewer_Guide.docx
+++ b/docs/MCA_Hunt_Interviewer_Guide.docx
@@ -217,6 +217,26 @@
       </w:r>
       <w:r>
         <w:t xml:space="preserve">If the phone dies, reopen and tap the interview to continue.</w:t>
+      </w:r>
+    </w:p>
+    <w:p>
+      <w:pPr>
+        <w:pStyle w:val="ListParagraph"/>
+        <w:numPr>
+          <w:ilvl w:val="0"/>
+          <w:numId w:val="2"/>
+        </w:numPr>
+        <w:spacing w:after="40"/>
+      </w:pPr>
+      <w:r>
+        <w:rPr>
+          <w:b/>
+          <w:bCs/>
+        </w:rPr>
+        <w:t xml:space="preserve">Check Location (GPS) is ON. </w:t>
+      </w:r>
+      <w:r>
+        <w:t xml:space="preserve">Each day before you start, make sure your phone’s Location is turned on and allowed for the app, so the interview location is captured.</w:t>
       </w:r>
     </w:p>
     <w:p>
@@ -365,10 +385,40 @@
           <w:b/>
           <w:bCs/>
         </w:rPr>
-        <w:t xml:space="preserve">Your quota (agree with your supervisor and write it here): </w:t>
-      </w:r>
-      <w:r>
-        <w:t xml:space="preserve">______ interviews per zone · at least ______ aged 40+ · at least ______ women.</w:t>
+        <w:t xml:space="preserve">Target: 45 people per zone. </w:t>
+      </w:r>
+      <w:r>
+        <w:t xml:space="preserve">Aim for roughly EQUAL numbers in three age groups — about 15 each in </w:t>
+      </w:r>
+      <w:r>
+        <w:rPr>
+          <w:b/>
+          <w:bCs/>
+        </w:rPr>
+        <w:t xml:space="preserve">25–39, 40–59, and 60+</w:t>
+      </w:r>
+      <w:r>
+        <w:t xml:space="preserve"> — and at least </w:t>
+      </w:r>
+      <w:r>
+        <w:rPr>
+          <w:b/>
+          <w:bCs/>
+        </w:rPr>
+        <w:t xml:space="preserve">20% women</w:t>
+      </w:r>
+      <w:r>
+        <w:t xml:space="preserve"> (≈9 per zone). Do </w:t>
+      </w:r>
+      <w:r>
+        <w:rPr>
+          <w:b/>
+          <w:bCs/>
+        </w:rPr>
+        <w:t xml:space="preserve">more</w:t>
+      </w:r>
+      <w:r>
+        <w:t xml:space="preserve"> where there are many fishers.</w:t>
       </w:r>
     </w:p>
     <w:p>
@@ -1908,7 +1958,7 @@
         <w:t xml:space="preserve">Review</w:t>
       </w:r>
       <w:r>
-        <w:t xml:space="preserve"> screen and glance over the answers.</w:t>
+        <w:t xml:space="preserve"> screen and glance over the answers. It shows whether consent, ID and GPS were captured.</w:t>
       </w:r>
     </w:p>
     <w:p>
@@ -1921,6 +1971,26 @@
         <w:spacing w:after="40"/>
       </w:pPr>
       <w:r>
+        <w:rPr>
+          <w:b/>
+          <w:bCs/>
+        </w:rPr>
+        <w:t xml:space="preserve">Read the thank-you aloud</w:t>
+      </w:r>
+      <w:r>
+        <w:t xml:space="preserve"> (shown on the Review screen): thank them for their time and explain their answers will help inform conservation planning.</w:t>
+      </w:r>
+    </w:p>
+    <w:p>
+      <w:pPr>
+        <w:pStyle w:val="ListParagraph"/>
+        <w:numPr>
+          <w:ilvl w:val="0"/>
+          <w:numId w:val="3"/>
+        </w:numPr>
+        <w:spacing w:after="40"/>
+      </w:pPr>
+      <w:r>
         <w:t xml:space="preserve">Tap </w:t>
       </w:r>
       <w:r>
@@ -1931,20 +2001,17 @@
         <w:t xml:space="preserve">Complete interview</w:t>
       </w:r>
       <w:r>
-        <w:t xml:space="preserve">. It’s saved on the phone.</w:t>
-      </w:r>
-    </w:p>
-    <w:p>
-      <w:pPr>
-        <w:pStyle w:val="ListParagraph"/>
-        <w:numPr>
-          <w:ilvl w:val="0"/>
-          <w:numId w:val="3"/>
-        </w:numPr>
-        <w:spacing w:after="40"/>
-      </w:pPr>
-      <w:r>
-        <w:t xml:space="preserve">Thank the respondent.</w:t>
+        <w:t xml:space="preserve">. If anything important is missing (consent, ID, GPS, or shares that don’t total 10) the app shows a </w:t>
+      </w:r>
+      <w:r>
+        <w:rPr>
+          <w:b/>
+          <w:bCs/>
+        </w:rPr>
+        <w:t xml:space="preserve">final check</w:t>
+      </w:r>
+      <w:r>
+        <w:t xml:space="preserve"> — fix it or confirm. It’s then saved on the phone.</w:t>
       </w:r>
     </w:p>
     <w:p>

</xml_diff>

<commit_message>
Fold post-pilot interviewer-guide edits into the generator
Incorporate the supervisor's marked-up additions from the field pilot:
- Subtitle now reads "fishing and hunting only — ... from the wild".
- New leading Golden Rule ("Research.") stating the study's purpose and
  the anonymity assurance.
- New reminder under "Hunting by age" that the age-band questions are
  about the respondent's past hunting and that years need not be exact.
- Module A gate wording made sex-neutral (dropped "(often women)").

Co-Authored-By: Claude Opus 4.8 <noreply@anthropic.com>
Claude-Session: https://claude.ai/code/session_01WBADq1mAGXBC8npA3LtAz1
</commit_message>
<xml_diff>
--- a/docs/MCA_Hunt_Interviewer_Guide.docx
+++ b/docs/MCA_Hunt_Interviewer_Guide.docx
@@ -57,10 +57,10 @@
           <w:b/>
           <w:bCs/>
         </w:rPr>
-        <w:t xml:space="preserve">hunting only</w:t>
-      </w:r>
-      <w:r>
-        <w:t xml:space="preserve"> — the taking of animals.</w:t>
+        <w:t xml:space="preserve">fishing and hunting only</w:t>
+      </w:r>
+      <w:r>
+        <w:t xml:space="preserve"> — the taking of animals from the wild.</w:t>
       </w:r>
     </w:p>
     <w:p>
@@ -77,6 +77,26 @@
           <w:szCs w:val="28"/>
         </w:rPr>
         <w:t xml:space="preserve">Golden rules (read first)</w:t>
+      </w:r>
+    </w:p>
+    <w:p>
+      <w:pPr>
+        <w:pStyle w:val="ListParagraph"/>
+        <w:numPr>
+          <w:ilvl w:val="0"/>
+          <w:numId w:val="2"/>
+        </w:numPr>
+        <w:spacing w:after="40"/>
+      </w:pPr>
+      <w:r>
+        <w:rPr>
+          <w:b/>
+          <w:bCs/>
+        </w:rPr>
+        <w:t xml:space="preserve">Research. </w:t>
+      </w:r>
+      <w:r>
+        <w:t xml:space="preserve">We want information about hunting so we can make better proposals for managing and monitoring hunting. Nothing here will be used against any individual, and anonymity can be assured.</w:t>
       </w:r>
     </w:p>
     <w:p>
@@ -538,7 +558,7 @@
         <w:t xml:space="preserve">Fishing (Module J)</w:t>
       </w:r>
       <w:r>
-        <w:t xml:space="preserve">. Use this for people (often women) who fish but don’t hunt. “Hunts” skips fishing; “Both” asks everything.</w:t>
+        <w:t xml:space="preserve">. Use this for people who fish but don’t hunt. “Hunts” skips fishing; “Both” asks everything.</w:t>
       </w:r>
     </w:p>
     <w:p>
@@ -606,6 +626,39 @@
       </w:r>
       <w:r>
         <w:t xml:space="preserve"> (older bands are hidden): “At that age, how often did you hunt?”</w:t>
+      </w:r>
+    </w:p>
+    <w:p>
+      <w:pPr>
+        <w:pBdr>
+          <w:left w:val="single" w:color="256D40" w:sz="18" w:space="8"/>
+        </w:pBdr>
+        <w:shd w:fill="EEF4EF" w:val="clear"/>
+        <w:spacing w:after="120" w:before="80"/>
+        <w:ind w:left="160"/>
+      </w:pPr>
+      <w:r>
+        <w:t xml:space="preserve">Remember, we are asking that person about their hunting </w:t>
+      </w:r>
+      <w:r>
+        <w:rPr>
+          <w:b/>
+          <w:bCs/>
+        </w:rPr>
+        <w:t xml:space="preserve">when they were younger</w:t>
+      </w:r>
+      <w:r>
+        <w:t xml:space="preserve">, so we get data about what hunting was like in the past. The years </w:t>
+      </w:r>
+      <w:r>
+        <w:rPr>
+          <w:b/>
+          <w:bCs/>
+        </w:rPr>
+        <w:t xml:space="preserve">do not</w:t>
+      </w:r>
+      <w:r>
+        <w:t xml:space="preserve"> need to be exact.</w:t>
       </w:r>
     </w:p>
     <w:p>

</xml_diff>